<commit_message>
fadding effect add kiya+download and numbers set kiye+responsiveness theek k
Co-authored-by: Copilot <copilot@github.com>
</commit_message>
<xml_diff>
--- a/Library-Management-System-Report.docx
+++ b/Library-Management-System-Report.docx
@@ -1,6 +1,6 @@
 
 <file path=word/document.xml><?xml version="1.0" encoding="utf-8"?>
-<w:document xmlns:wpc="http://schemas.microsoft.com/office/word/2010/wordprocessingCanvas" xmlns:mc="http://schemas.openxmlformats.org/markup-compatibility/2006" xmlns:o="urn:schemas-microsoft-com:office:office" xmlns:r="http://schemas.openxmlformats.org/officeDocument/2006/relationships" xmlns:m="http://schemas.openxmlformats.org/officeDocument/2006/math" xmlns:v="urn:schemas-microsoft-com:vml" xmlns:wp14="http://schemas.microsoft.com/office/word/2010/wordprocessingDrawing" xmlns:wp="http://schemas.openxmlformats.org/drawingml/2006/wordprocessingDrawing" xmlns:w10="urn:schemas-microsoft-com:office:word" xmlns:w="http://schemas.openxmlformats.org/wordprocessingml/2006/main" xmlns:w14="http://schemas.microsoft.com/office/word/2010/wordml" xmlns:w15="http://schemas.microsoft.com/office/word/2012/wordml" xmlns:wpg="http://schemas.microsoft.com/office/word/2010/wordprocessingGroup" xmlns:wpi="http://schemas.microsoft.com/office/word/2010/wordprocessingInk" xmlns:wne="http://schemas.microsoft.com/office/word/2006/wordml" xmlns:wps="http://schemas.microsoft.com/office/word/2010/wordprocessingShape" mc:Ignorable="w14 w15 wp14">
+<w:document xmlns:wpc="http://schemas.microsoft.com/office/word/2010/wordprocessingCanvas" xmlns:cx="http://schemas.microsoft.com/office/drawing/2014/chartex" xmlns:cx1="http://schemas.microsoft.com/office/drawing/2015/9/8/chartex" xmlns:cx2="http://schemas.microsoft.com/office/drawing/2015/10/21/chartex" xmlns:cx3="http://schemas.microsoft.com/office/drawing/2016/5/9/chartex" xmlns:cx4="http://schemas.microsoft.com/office/drawing/2016/5/10/chartex" xmlns:cx5="http://schemas.microsoft.com/office/drawing/2016/5/11/chartex" xmlns:cx6="http://schemas.microsoft.com/office/drawing/2016/5/12/chartex" xmlns:cx7="http://schemas.microsoft.com/office/drawing/2016/5/13/chartex" xmlns:cx8="http://schemas.microsoft.com/office/drawing/2016/5/14/chartex" xmlns:mc="http://schemas.openxmlformats.org/markup-compatibility/2006" xmlns:aink="http://schemas.microsoft.com/office/drawing/2016/ink" xmlns:am3d="http://schemas.microsoft.com/office/drawing/2017/model3d" xmlns:o="urn:schemas-microsoft-com:office:office" xmlns:oel="http://schemas.microsoft.com/office/2019/extlst" xmlns:r="http://schemas.openxmlformats.org/officeDocument/2006/relationships" xmlns:m="http://schemas.openxmlformats.org/officeDocument/2006/math" xmlns:v="urn:schemas-microsoft-com:vml" xmlns:wp14="http://schemas.microsoft.com/office/word/2010/wordprocessingDrawing" xmlns:wp="http://schemas.openxmlformats.org/drawingml/2006/wordprocessingDrawing" xmlns:w10="urn:schemas-microsoft-com:office:word" xmlns:w="http://schemas.openxmlformats.org/wordprocessingml/2006/main" xmlns:w14="http://schemas.microsoft.com/office/word/2010/wordml" xmlns:w15="http://schemas.microsoft.com/office/word/2012/wordml" xmlns:w16cex="http://schemas.microsoft.com/office/word/2018/wordml/cex" xmlns:w16cid="http://schemas.microsoft.com/office/word/2016/wordml/cid" xmlns:w16="http://schemas.microsoft.com/office/word/2018/wordml" xmlns:w16du="http://schemas.microsoft.com/office/word/2023/wordml/word16du" xmlns:w16sdtdh="http://schemas.microsoft.com/office/word/2020/wordml/sdtdatahash" xmlns:w16sdtfl="http://schemas.microsoft.com/office/word/2024/wordml/sdtformatlock" xmlns:w16se="http://schemas.microsoft.com/office/word/2015/wordml/symex" xmlns:wpg="http://schemas.microsoft.com/office/word/2010/wordprocessingGroup" xmlns:wpi="http://schemas.microsoft.com/office/word/2010/wordprocessingInk" xmlns:wne="http://schemas.microsoft.com/office/word/2006/wordml" xmlns:wps="http://schemas.microsoft.com/office/word/2010/wordprocessingShape" mc:Ignorable="w14 w15 w16se w16cid w16 w16cex w16sdtdh w16sdtfl w16du wp14">
   <w:body>
     <w:p>
       <w:pPr>
@@ -38,7 +38,7 @@
         <mc:AlternateContent>
           <mc:Choice Requires="wps">
             <w:drawing>
-              <wp:anchor distT="0" distB="0" distL="114300" distR="114300" simplePos="0" relativeHeight="251659264" behindDoc="0" locked="0" layoutInCell="1" allowOverlap="1">
+              <wp:anchor distT="0" distB="0" distL="114300" distR="114300" simplePos="0" relativeHeight="251659264" behindDoc="0" locked="0" layoutInCell="1" allowOverlap="1" wp14:anchorId="78241360" wp14:editId="1B085060">
                 <wp:simplePos x="0" y="0"/>
                 <wp:positionH relativeFrom="column">
                   <wp:posOffset>297180</wp:posOffset>
@@ -150,11 +150,11 @@
           </mc:Choice>
           <mc:Fallback>
             <w:pict>
-              <v:shapetype id="_x0000_t202" coordsize="21600,21600" o:spt="202" path="m,l,21600r21600,l21600,xe">
+              <v:shapetype w14:anchorId="78241360" id="_x0000_t202" coordsize="21600,21600" o:spt="202" path="m,l,21600r21600,l21600,xe">
                 <v:stroke joinstyle="miter"/>
                 <v:path gradientshapeok="t" o:connecttype="rect"/>
               </v:shapetype>
-              <v:shape id="Text Box 1" o:spid="_x0000_s1026" type="#_x0000_t202" style="position:absolute;margin-left:23.4pt;margin-top:25.25pt;width:434.4pt;height:96pt;z-index:251659264;visibility:visible;mso-wrap-style:square;mso-width-percent:0;mso-height-percent:0;mso-wrap-distance-left:9pt;mso-wrap-distance-top:0;mso-wrap-distance-right:9pt;mso-wrap-distance-bottom:0;mso-position-horizontal:absolute;mso-position-horizontal-relative:text;mso-position-vertical:absolute;mso-position-vertical-relative:text;mso-width-percent:0;mso-height-percent:0;mso-width-relative:margin;mso-height-relative:margin;v-text-anchor:top" o:gfxdata="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" fillcolor="#d9e2f3 [664]" strokecolor="#2f5496 [2408]" strokeweight="1pt">
+              <v:shape id="Text Box 1" o:spid="_x0000_s1026" type="#_x0000_t202" style="position:absolute;margin-left:23.4pt;margin-top:25.25pt;width:434.4pt;height:96pt;z-index:251659264;visibility:visible;mso-wrap-style:square;mso-width-percent:0;mso-height-percent:0;mso-wrap-distance-left:9pt;mso-wrap-distance-top:0;mso-wrap-distance-right:9pt;mso-wrap-distance-bottom:0;mso-position-horizontal:absolute;mso-position-horizontal-relative:text;mso-position-vertical:absolute;mso-position-vertical-relative:text;mso-width-percent:0;mso-height-percent:0;mso-width-relative:margin;mso-height-relative:margin;v-text-anchor:top" o:gfxdata="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" fillcolor="#d9e2f3 [664]" strokecolor="#2f5496 [2408]" strokeweight="1pt">
                 <v:textbox>
                   <w:txbxContent>
                     <w:p>
@@ -494,7 +494,6 @@
           <w:sz w:val="32"/>
         </w:rPr>
       </w:pPr>
-      <w:bookmarkStart w:id="0" w:name="_GoBack"/>
       <w:r>
         <w:rPr>
           <w:rFonts w:ascii="Times New Roman" w:hAnsi="Times New Roman" w:cs="Times New Roman"/>
@@ -534,7 +533,6 @@
         <w:t xml:space="preserve">                              </w:t>
       </w:r>
     </w:p>
-    <w:bookmarkEnd w:id="0"/>
     <w:p>
       <w:pPr>
         <w:rPr>
@@ -925,6 +923,53 @@
       <w:pPr>
         <w:rPr>
           <w:rFonts w:ascii="Times New Roman" w:hAnsi="Times New Roman" w:cs="Times New Roman"/>
+        </w:rPr>
+      </w:pPr>
+      <w:r>
+        <w:rPr>
+          <w:rFonts w:ascii="Times New Roman" w:hAnsi="Times New Roman" w:cs="Times New Roman"/>
+        </w:rPr>
+        <w:drawing>
+          <wp:inline distT="0" distB="0" distL="0" distR="0" wp14:anchorId="1D82E9D2" wp14:editId="023E264B">
+            <wp:extent cx="5943600" cy="3321685"/>
+            <wp:effectExtent l="0" t="0" r="0" b="0"/>
+            <wp:docPr id="353887398" name="Picture 1"/>
+            <wp:cNvGraphicFramePr>
+              <a:graphicFrameLocks xmlns:a="http://schemas.openxmlformats.org/drawingml/2006/main" noChangeAspect="1"/>
+            </wp:cNvGraphicFramePr>
+            <a:graphic xmlns:a="http://schemas.openxmlformats.org/drawingml/2006/main">
+              <a:graphicData uri="http://schemas.openxmlformats.org/drawingml/2006/picture">
+                <pic:pic xmlns:pic="http://schemas.openxmlformats.org/drawingml/2006/picture">
+                  <pic:nvPicPr>
+                    <pic:cNvPr id="353887398" name=""/>
+                    <pic:cNvPicPr/>
+                  </pic:nvPicPr>
+                  <pic:blipFill>
+                    <a:blip r:embed="rId8"/>
+                    <a:stretch>
+                      <a:fillRect/>
+                    </a:stretch>
+                  </pic:blipFill>
+                  <pic:spPr>
+                    <a:xfrm>
+                      <a:off x="0" y="0"/>
+                      <a:ext cx="5943600" cy="3321685"/>
+                    </a:xfrm>
+                    <a:prstGeom prst="rect">
+                      <a:avLst/>
+                    </a:prstGeom>
+                  </pic:spPr>
+                </pic:pic>
+              </a:graphicData>
+            </a:graphic>
+          </wp:inline>
+        </w:drawing>
+      </w:r>
+    </w:p>
+    <w:p>
+      <w:pPr>
+        <w:rPr>
+          <w:rFonts w:ascii="Times New Roman" w:hAnsi="Times New Roman" w:cs="Times New Roman"/>
           <w:b/>
           <w:sz w:val="28"/>
           <w:u w:val="single"/>
@@ -1027,7 +1072,14 @@
         <w:rPr>
           <w:rFonts w:ascii="Times New Roman" w:hAnsi="Times New Roman" w:cs="Times New Roman"/>
         </w:rPr>
-        <w:t>But nowadays modern technologies like computer has made it easy to manage a large library. The modern library management system has helped the admin by making their tasks easy and by saving their time by saving all the information in computer. By just one click we can access all the information of students, books he have issued, date of issue, date of return and fine calculated.</w:t>
+        <w:t xml:space="preserve">But nowadays modern technologies like computer has made it easy to manage a large library. The modern library management system has helped the admin by making their tasks easy and by saving their time by </w:t>
+      </w:r>
+      <w:r>
+        <w:rPr>
+          <w:rFonts w:ascii="Times New Roman" w:hAnsi="Times New Roman" w:cs="Times New Roman"/>
+        </w:rPr>
+        <w:lastRenderedPageBreak/>
+        <w:t>saving all the information in computer. By just one click we can access all the information of students, books he have issued, date of issue, date of return and fine calculated.</w:t>
       </w:r>
     </w:p>
     <w:p>
@@ -1187,12 +1239,12 @@
       </w:r>
     </w:p>
     <w:sectPr>
-      <w:headerReference w:type="even" r:id="rId8"/>
-      <w:headerReference w:type="default" r:id="rId9"/>
-      <w:footerReference w:type="even" r:id="rId10"/>
-      <w:footerReference w:type="default" r:id="rId11"/>
-      <w:headerReference w:type="first" r:id="rId12"/>
-      <w:footerReference w:type="first" r:id="rId13"/>
+      <w:headerReference w:type="even" r:id="rId9"/>
+      <w:headerReference w:type="default" r:id="rId10"/>
+      <w:footerReference w:type="even" r:id="rId11"/>
+      <w:footerReference w:type="default" r:id="rId12"/>
+      <w:headerReference w:type="first" r:id="rId13"/>
+      <w:footerReference w:type="first" r:id="rId14"/>
       <w:pgSz w:w="12240" w:h="15840"/>
       <w:pgMar w:top="1440" w:right="1440" w:bottom="1440" w:left="1440" w:header="720" w:footer="720" w:gutter="0"/>
       <w:cols w:space="720"/>
@@ -1203,7 +1255,7 @@
 </file>
 
 <file path=word/endnotes.xml><?xml version="1.0" encoding="utf-8"?>
-<w:endnotes xmlns:wpc="http://schemas.microsoft.com/office/word/2010/wordprocessingCanvas" xmlns:mc="http://schemas.openxmlformats.org/markup-compatibility/2006" xmlns:o="urn:schemas-microsoft-com:office:office" xmlns:r="http://schemas.openxmlformats.org/officeDocument/2006/relationships" xmlns:m="http://schemas.openxmlformats.org/officeDocument/2006/math" xmlns:v="urn:schemas-microsoft-com:vml" xmlns:wp14="http://schemas.microsoft.com/office/word/2010/wordprocessingDrawing" xmlns:wp="http://schemas.openxmlformats.org/drawingml/2006/wordprocessingDrawing" xmlns:w10="urn:schemas-microsoft-com:office:word" xmlns:w="http://schemas.openxmlformats.org/wordprocessingml/2006/main" xmlns:w14="http://schemas.microsoft.com/office/word/2010/wordml" xmlns:w15="http://schemas.microsoft.com/office/word/2012/wordml" xmlns:wpg="http://schemas.microsoft.com/office/word/2010/wordprocessingGroup" xmlns:wpi="http://schemas.microsoft.com/office/word/2010/wordprocessingInk" xmlns:wne="http://schemas.microsoft.com/office/word/2006/wordml" xmlns:wps="http://schemas.microsoft.com/office/word/2010/wordprocessingShape" mc:Ignorable="w14 w15 wp14">
+<w:endnotes xmlns:wpc="http://schemas.microsoft.com/office/word/2010/wordprocessingCanvas" xmlns:cx="http://schemas.microsoft.com/office/drawing/2014/chartex" xmlns:cx1="http://schemas.microsoft.com/office/drawing/2015/9/8/chartex" xmlns:cx2="http://schemas.microsoft.com/office/drawing/2015/10/21/chartex" xmlns:cx3="http://schemas.microsoft.com/office/drawing/2016/5/9/chartex" xmlns:cx4="http://schemas.microsoft.com/office/drawing/2016/5/10/chartex" xmlns:cx5="http://schemas.microsoft.com/office/drawing/2016/5/11/chartex" xmlns:cx6="http://schemas.microsoft.com/office/drawing/2016/5/12/chartex" xmlns:cx7="http://schemas.microsoft.com/office/drawing/2016/5/13/chartex" xmlns:cx8="http://schemas.microsoft.com/office/drawing/2016/5/14/chartex" xmlns:mc="http://schemas.openxmlformats.org/markup-compatibility/2006" xmlns:aink="http://schemas.microsoft.com/office/drawing/2016/ink" xmlns:am3d="http://schemas.microsoft.com/office/drawing/2017/model3d" xmlns:o="urn:schemas-microsoft-com:office:office" xmlns:oel="http://schemas.microsoft.com/office/2019/extlst" xmlns:r="http://schemas.openxmlformats.org/officeDocument/2006/relationships" xmlns:m="http://schemas.openxmlformats.org/officeDocument/2006/math" xmlns:v="urn:schemas-microsoft-com:vml" xmlns:wp14="http://schemas.microsoft.com/office/word/2010/wordprocessingDrawing" xmlns:wp="http://schemas.openxmlformats.org/drawingml/2006/wordprocessingDrawing" xmlns:w10="urn:schemas-microsoft-com:office:word" xmlns:w="http://schemas.openxmlformats.org/wordprocessingml/2006/main" xmlns:w14="http://schemas.microsoft.com/office/word/2010/wordml" xmlns:w15="http://schemas.microsoft.com/office/word/2012/wordml" xmlns:w16cex="http://schemas.microsoft.com/office/word/2018/wordml/cex" xmlns:w16cid="http://schemas.microsoft.com/office/word/2016/wordml/cid" xmlns:w16="http://schemas.microsoft.com/office/word/2018/wordml" xmlns:w16du="http://schemas.microsoft.com/office/word/2023/wordml/word16du" xmlns:w16sdtdh="http://schemas.microsoft.com/office/word/2020/wordml/sdtdatahash" xmlns:w16sdtfl="http://schemas.microsoft.com/office/word/2024/wordml/sdtformatlock" xmlns:w16se="http://schemas.microsoft.com/office/word/2015/wordml/symex" xmlns:wpg="http://schemas.microsoft.com/office/word/2010/wordprocessingGroup" xmlns:wpi="http://schemas.microsoft.com/office/word/2010/wordprocessingInk" xmlns:wne="http://schemas.microsoft.com/office/word/2006/wordml" xmlns:wps="http://schemas.microsoft.com/office/word/2010/wordprocessingShape" mc:Ignorable="w14 w15 w16se w16cid w16 w16cex w16sdtdh w16sdtfl w16du wp14">
   <w:endnote w:type="separator" w:id="-1">
     <w:p>
       <w:pPr>
@@ -1228,7 +1280,7 @@
 </file>
 
 <file path=word/footer1.xml><?xml version="1.0" encoding="utf-8"?>
-<w:ftr xmlns:wpc="http://schemas.microsoft.com/office/word/2010/wordprocessingCanvas" xmlns:mc="http://schemas.openxmlformats.org/markup-compatibility/2006" xmlns:o="urn:schemas-microsoft-com:office:office" xmlns:r="http://schemas.openxmlformats.org/officeDocument/2006/relationships" xmlns:m="http://schemas.openxmlformats.org/officeDocument/2006/math" xmlns:v="urn:schemas-microsoft-com:vml" xmlns:wp14="http://schemas.microsoft.com/office/word/2010/wordprocessingDrawing" xmlns:wp="http://schemas.openxmlformats.org/drawingml/2006/wordprocessingDrawing" xmlns:w10="urn:schemas-microsoft-com:office:word" xmlns:w="http://schemas.openxmlformats.org/wordprocessingml/2006/main" xmlns:w14="http://schemas.microsoft.com/office/word/2010/wordml" xmlns:w15="http://schemas.microsoft.com/office/word/2012/wordml" xmlns:wpg="http://schemas.microsoft.com/office/word/2010/wordprocessingGroup" xmlns:wpi="http://schemas.microsoft.com/office/word/2010/wordprocessingInk" xmlns:wne="http://schemas.microsoft.com/office/word/2006/wordml" xmlns:wps="http://schemas.microsoft.com/office/word/2010/wordprocessingShape" mc:Ignorable="w14 w15 wp14">
+<w:ftr xmlns:wpc="http://schemas.microsoft.com/office/word/2010/wordprocessingCanvas" xmlns:cx="http://schemas.microsoft.com/office/drawing/2014/chartex" xmlns:cx1="http://schemas.microsoft.com/office/drawing/2015/9/8/chartex" xmlns:cx2="http://schemas.microsoft.com/office/drawing/2015/10/21/chartex" xmlns:cx3="http://schemas.microsoft.com/office/drawing/2016/5/9/chartex" xmlns:cx4="http://schemas.microsoft.com/office/drawing/2016/5/10/chartex" xmlns:cx5="http://schemas.microsoft.com/office/drawing/2016/5/11/chartex" xmlns:cx6="http://schemas.microsoft.com/office/drawing/2016/5/12/chartex" xmlns:cx7="http://schemas.microsoft.com/office/drawing/2016/5/13/chartex" xmlns:cx8="http://schemas.microsoft.com/office/drawing/2016/5/14/chartex" xmlns:mc="http://schemas.openxmlformats.org/markup-compatibility/2006" xmlns:aink="http://schemas.microsoft.com/office/drawing/2016/ink" xmlns:am3d="http://schemas.microsoft.com/office/drawing/2017/model3d" xmlns:o="urn:schemas-microsoft-com:office:office" xmlns:oel="http://schemas.microsoft.com/office/2019/extlst" xmlns:r="http://schemas.openxmlformats.org/officeDocument/2006/relationships" xmlns:m="http://schemas.openxmlformats.org/officeDocument/2006/math" xmlns:v="urn:schemas-microsoft-com:vml" xmlns:wp14="http://schemas.microsoft.com/office/word/2010/wordprocessingDrawing" xmlns:wp="http://schemas.openxmlformats.org/drawingml/2006/wordprocessingDrawing" xmlns:w10="urn:schemas-microsoft-com:office:word" xmlns:w="http://schemas.openxmlformats.org/wordprocessingml/2006/main" xmlns:w14="http://schemas.microsoft.com/office/word/2010/wordml" xmlns:w15="http://schemas.microsoft.com/office/word/2012/wordml" xmlns:w16cex="http://schemas.microsoft.com/office/word/2018/wordml/cex" xmlns:w16cid="http://schemas.microsoft.com/office/word/2016/wordml/cid" xmlns:w16="http://schemas.microsoft.com/office/word/2018/wordml" xmlns:w16du="http://schemas.microsoft.com/office/word/2023/wordml/word16du" xmlns:w16sdtdh="http://schemas.microsoft.com/office/word/2020/wordml/sdtdatahash" xmlns:w16sdtfl="http://schemas.microsoft.com/office/word/2024/wordml/sdtformatlock" xmlns:w16se="http://schemas.microsoft.com/office/word/2015/wordml/symex" xmlns:wpg="http://schemas.microsoft.com/office/word/2010/wordprocessingGroup" xmlns:wpi="http://schemas.microsoft.com/office/word/2010/wordprocessingInk" xmlns:wne="http://schemas.microsoft.com/office/word/2006/wordml" xmlns:wps="http://schemas.microsoft.com/office/word/2010/wordprocessingShape" mc:Ignorable="w14 w15 w16se w16cid w16 w16cex w16sdtdh w16sdtfl w16du wp14">
   <w:p>
     <w:pPr>
       <w:pStyle w:val="Footer"/>
@@ -1238,7 +1290,7 @@
 </file>
 
 <file path=word/footer2.xml><?xml version="1.0" encoding="utf-8"?>
-<w:ftr xmlns:wpc="http://schemas.microsoft.com/office/word/2010/wordprocessingCanvas" xmlns:mc="http://schemas.openxmlformats.org/markup-compatibility/2006" xmlns:o="urn:schemas-microsoft-com:office:office" xmlns:r="http://schemas.openxmlformats.org/officeDocument/2006/relationships" xmlns:m="http://schemas.openxmlformats.org/officeDocument/2006/math" xmlns:v="urn:schemas-microsoft-com:vml" xmlns:wp14="http://schemas.microsoft.com/office/word/2010/wordprocessingDrawing" xmlns:wp="http://schemas.openxmlformats.org/drawingml/2006/wordprocessingDrawing" xmlns:w10="urn:schemas-microsoft-com:office:word" xmlns:w="http://schemas.openxmlformats.org/wordprocessingml/2006/main" xmlns:w14="http://schemas.microsoft.com/office/word/2010/wordml" xmlns:w15="http://schemas.microsoft.com/office/word/2012/wordml" xmlns:wpg="http://schemas.microsoft.com/office/word/2010/wordprocessingGroup" xmlns:wpi="http://schemas.microsoft.com/office/word/2010/wordprocessingInk" xmlns:wne="http://schemas.microsoft.com/office/word/2006/wordml" xmlns:wps="http://schemas.microsoft.com/office/word/2010/wordprocessingShape" mc:Ignorable="w14 w15 wp14">
+<w:ftr xmlns:wpc="http://schemas.microsoft.com/office/word/2010/wordprocessingCanvas" xmlns:cx="http://schemas.microsoft.com/office/drawing/2014/chartex" xmlns:cx1="http://schemas.microsoft.com/office/drawing/2015/9/8/chartex" xmlns:cx2="http://schemas.microsoft.com/office/drawing/2015/10/21/chartex" xmlns:cx3="http://schemas.microsoft.com/office/drawing/2016/5/9/chartex" xmlns:cx4="http://schemas.microsoft.com/office/drawing/2016/5/10/chartex" xmlns:cx5="http://schemas.microsoft.com/office/drawing/2016/5/11/chartex" xmlns:cx6="http://schemas.microsoft.com/office/drawing/2016/5/12/chartex" xmlns:cx7="http://schemas.microsoft.com/office/drawing/2016/5/13/chartex" xmlns:cx8="http://schemas.microsoft.com/office/drawing/2016/5/14/chartex" xmlns:mc="http://schemas.openxmlformats.org/markup-compatibility/2006" xmlns:aink="http://schemas.microsoft.com/office/drawing/2016/ink" xmlns:am3d="http://schemas.microsoft.com/office/drawing/2017/model3d" xmlns:o="urn:schemas-microsoft-com:office:office" xmlns:oel="http://schemas.microsoft.com/office/2019/extlst" xmlns:r="http://schemas.openxmlformats.org/officeDocument/2006/relationships" xmlns:m="http://schemas.openxmlformats.org/officeDocument/2006/math" xmlns:v="urn:schemas-microsoft-com:vml" xmlns:wp14="http://schemas.microsoft.com/office/word/2010/wordprocessingDrawing" xmlns:wp="http://schemas.openxmlformats.org/drawingml/2006/wordprocessingDrawing" xmlns:w10="urn:schemas-microsoft-com:office:word" xmlns:w="http://schemas.openxmlformats.org/wordprocessingml/2006/main" xmlns:w14="http://schemas.microsoft.com/office/word/2010/wordml" xmlns:w15="http://schemas.microsoft.com/office/word/2012/wordml" xmlns:w16cex="http://schemas.microsoft.com/office/word/2018/wordml/cex" xmlns:w16cid="http://schemas.microsoft.com/office/word/2016/wordml/cid" xmlns:w16="http://schemas.microsoft.com/office/word/2018/wordml" xmlns:w16du="http://schemas.microsoft.com/office/word/2023/wordml/word16du" xmlns:w16sdtdh="http://schemas.microsoft.com/office/word/2020/wordml/sdtdatahash" xmlns:w16sdtfl="http://schemas.microsoft.com/office/word/2024/wordml/sdtformatlock" xmlns:w16se="http://schemas.microsoft.com/office/word/2015/wordml/symex" xmlns:wpg="http://schemas.microsoft.com/office/word/2010/wordprocessingGroup" xmlns:wpi="http://schemas.microsoft.com/office/word/2010/wordprocessingInk" xmlns:wne="http://schemas.microsoft.com/office/word/2006/wordml" xmlns:wps="http://schemas.microsoft.com/office/word/2010/wordprocessingShape" mc:Ignorable="w14 w15 w16se w16cid w16 w16cex w16sdtdh w16sdtfl w16du wp14">
   <w:p>
     <w:pPr>
       <w:pStyle w:val="Footer"/>
@@ -1248,7 +1300,7 @@
 </file>
 
 <file path=word/footer3.xml><?xml version="1.0" encoding="utf-8"?>
-<w:ftr xmlns:wpc="http://schemas.microsoft.com/office/word/2010/wordprocessingCanvas" xmlns:mc="http://schemas.openxmlformats.org/markup-compatibility/2006" xmlns:o="urn:schemas-microsoft-com:office:office" xmlns:r="http://schemas.openxmlformats.org/officeDocument/2006/relationships" xmlns:m="http://schemas.openxmlformats.org/officeDocument/2006/math" xmlns:v="urn:schemas-microsoft-com:vml" xmlns:wp14="http://schemas.microsoft.com/office/word/2010/wordprocessingDrawing" xmlns:wp="http://schemas.openxmlformats.org/drawingml/2006/wordprocessingDrawing" xmlns:w10="urn:schemas-microsoft-com:office:word" xmlns:w="http://schemas.openxmlformats.org/wordprocessingml/2006/main" xmlns:w14="http://schemas.microsoft.com/office/word/2010/wordml" xmlns:w15="http://schemas.microsoft.com/office/word/2012/wordml" xmlns:wpg="http://schemas.microsoft.com/office/word/2010/wordprocessingGroup" xmlns:wpi="http://schemas.microsoft.com/office/word/2010/wordprocessingInk" xmlns:wne="http://schemas.microsoft.com/office/word/2006/wordml" xmlns:wps="http://schemas.microsoft.com/office/word/2010/wordprocessingShape" mc:Ignorable="w14 w15 wp14">
+<w:ftr xmlns:wpc="http://schemas.microsoft.com/office/word/2010/wordprocessingCanvas" xmlns:cx="http://schemas.microsoft.com/office/drawing/2014/chartex" xmlns:cx1="http://schemas.microsoft.com/office/drawing/2015/9/8/chartex" xmlns:cx2="http://schemas.microsoft.com/office/drawing/2015/10/21/chartex" xmlns:cx3="http://schemas.microsoft.com/office/drawing/2016/5/9/chartex" xmlns:cx4="http://schemas.microsoft.com/office/drawing/2016/5/10/chartex" xmlns:cx5="http://schemas.microsoft.com/office/drawing/2016/5/11/chartex" xmlns:cx6="http://schemas.microsoft.com/office/drawing/2016/5/12/chartex" xmlns:cx7="http://schemas.microsoft.com/office/drawing/2016/5/13/chartex" xmlns:cx8="http://schemas.microsoft.com/office/drawing/2016/5/14/chartex" xmlns:mc="http://schemas.openxmlformats.org/markup-compatibility/2006" xmlns:aink="http://schemas.microsoft.com/office/drawing/2016/ink" xmlns:am3d="http://schemas.microsoft.com/office/drawing/2017/model3d" xmlns:o="urn:schemas-microsoft-com:office:office" xmlns:oel="http://schemas.microsoft.com/office/2019/extlst" xmlns:r="http://schemas.openxmlformats.org/officeDocument/2006/relationships" xmlns:m="http://schemas.openxmlformats.org/officeDocument/2006/math" xmlns:v="urn:schemas-microsoft-com:vml" xmlns:wp14="http://schemas.microsoft.com/office/word/2010/wordprocessingDrawing" xmlns:wp="http://schemas.openxmlformats.org/drawingml/2006/wordprocessingDrawing" xmlns:w10="urn:schemas-microsoft-com:office:word" xmlns:w="http://schemas.openxmlformats.org/wordprocessingml/2006/main" xmlns:w14="http://schemas.microsoft.com/office/word/2010/wordml" xmlns:w15="http://schemas.microsoft.com/office/word/2012/wordml" xmlns:w16cex="http://schemas.microsoft.com/office/word/2018/wordml/cex" xmlns:w16cid="http://schemas.microsoft.com/office/word/2016/wordml/cid" xmlns:w16="http://schemas.microsoft.com/office/word/2018/wordml" xmlns:w16du="http://schemas.microsoft.com/office/word/2023/wordml/word16du" xmlns:w16sdtdh="http://schemas.microsoft.com/office/word/2020/wordml/sdtdatahash" xmlns:w16sdtfl="http://schemas.microsoft.com/office/word/2024/wordml/sdtformatlock" xmlns:w16se="http://schemas.microsoft.com/office/word/2015/wordml/symex" xmlns:wpg="http://schemas.microsoft.com/office/word/2010/wordprocessingGroup" xmlns:wpi="http://schemas.microsoft.com/office/word/2010/wordprocessingInk" xmlns:wne="http://schemas.microsoft.com/office/word/2006/wordml" xmlns:wps="http://schemas.microsoft.com/office/word/2010/wordprocessingShape" mc:Ignorable="w14 w15 w16se w16cid w16 w16cex w16sdtdh w16sdtfl w16du wp14">
   <w:p>
     <w:pPr>
       <w:pStyle w:val="Footer"/>
@@ -1258,7 +1310,7 @@
 </file>
 
 <file path=word/footnotes.xml><?xml version="1.0" encoding="utf-8"?>
-<w:footnotes xmlns:wpc="http://schemas.microsoft.com/office/word/2010/wordprocessingCanvas" xmlns:mc="http://schemas.openxmlformats.org/markup-compatibility/2006" xmlns:o="urn:schemas-microsoft-com:office:office" xmlns:r="http://schemas.openxmlformats.org/officeDocument/2006/relationships" xmlns:m="http://schemas.openxmlformats.org/officeDocument/2006/math" xmlns:v="urn:schemas-microsoft-com:vml" xmlns:wp14="http://schemas.microsoft.com/office/word/2010/wordprocessingDrawing" xmlns:wp="http://schemas.openxmlformats.org/drawingml/2006/wordprocessingDrawing" xmlns:w10="urn:schemas-microsoft-com:office:word" xmlns:w="http://schemas.openxmlformats.org/wordprocessingml/2006/main" xmlns:w14="http://schemas.microsoft.com/office/word/2010/wordml" xmlns:w15="http://schemas.microsoft.com/office/word/2012/wordml" xmlns:wpg="http://schemas.microsoft.com/office/word/2010/wordprocessingGroup" xmlns:wpi="http://schemas.microsoft.com/office/word/2010/wordprocessingInk" xmlns:wne="http://schemas.microsoft.com/office/word/2006/wordml" xmlns:wps="http://schemas.microsoft.com/office/word/2010/wordprocessingShape" mc:Ignorable="w14 w15 wp14">
+<w:footnotes xmlns:wpc="http://schemas.microsoft.com/office/word/2010/wordprocessingCanvas" xmlns:cx="http://schemas.microsoft.com/office/drawing/2014/chartex" xmlns:cx1="http://schemas.microsoft.com/office/drawing/2015/9/8/chartex" xmlns:cx2="http://schemas.microsoft.com/office/drawing/2015/10/21/chartex" xmlns:cx3="http://schemas.microsoft.com/office/drawing/2016/5/9/chartex" xmlns:cx4="http://schemas.microsoft.com/office/drawing/2016/5/10/chartex" xmlns:cx5="http://schemas.microsoft.com/office/drawing/2016/5/11/chartex" xmlns:cx6="http://schemas.microsoft.com/office/drawing/2016/5/12/chartex" xmlns:cx7="http://schemas.microsoft.com/office/drawing/2016/5/13/chartex" xmlns:cx8="http://schemas.microsoft.com/office/drawing/2016/5/14/chartex" xmlns:mc="http://schemas.openxmlformats.org/markup-compatibility/2006" xmlns:aink="http://schemas.microsoft.com/office/drawing/2016/ink" xmlns:am3d="http://schemas.microsoft.com/office/drawing/2017/model3d" xmlns:o="urn:schemas-microsoft-com:office:office" xmlns:oel="http://schemas.microsoft.com/office/2019/extlst" xmlns:r="http://schemas.openxmlformats.org/officeDocument/2006/relationships" xmlns:m="http://schemas.openxmlformats.org/officeDocument/2006/math" xmlns:v="urn:schemas-microsoft-com:vml" xmlns:wp14="http://schemas.microsoft.com/office/word/2010/wordprocessingDrawing" xmlns:wp="http://schemas.openxmlformats.org/drawingml/2006/wordprocessingDrawing" xmlns:w10="urn:schemas-microsoft-com:office:word" xmlns:w="http://schemas.openxmlformats.org/wordprocessingml/2006/main" xmlns:w14="http://schemas.microsoft.com/office/word/2010/wordml" xmlns:w15="http://schemas.microsoft.com/office/word/2012/wordml" xmlns:w16cex="http://schemas.microsoft.com/office/word/2018/wordml/cex" xmlns:w16cid="http://schemas.microsoft.com/office/word/2016/wordml/cid" xmlns:w16="http://schemas.microsoft.com/office/word/2018/wordml" xmlns:w16du="http://schemas.microsoft.com/office/word/2023/wordml/word16du" xmlns:w16sdtdh="http://schemas.microsoft.com/office/word/2020/wordml/sdtdatahash" xmlns:w16sdtfl="http://schemas.microsoft.com/office/word/2024/wordml/sdtformatlock" xmlns:w16se="http://schemas.microsoft.com/office/word/2015/wordml/symex" xmlns:wpg="http://schemas.microsoft.com/office/word/2010/wordprocessingGroup" xmlns:wpi="http://schemas.microsoft.com/office/word/2010/wordprocessingInk" xmlns:wne="http://schemas.microsoft.com/office/word/2006/wordml" xmlns:wps="http://schemas.microsoft.com/office/word/2010/wordprocessingShape" mc:Ignorable="w14 w15 w16se w16cid w16 w16cex w16sdtdh w16sdtfl w16du wp14">
   <w:footnote w:type="separator" w:id="-1">
     <w:p>
       <w:pPr>
@@ -1283,7 +1335,7 @@
 </file>
 
 <file path=word/header1.xml><?xml version="1.0" encoding="utf-8"?>
-<w:hdr xmlns:wpc="http://schemas.microsoft.com/office/word/2010/wordprocessingCanvas" xmlns:mc="http://schemas.openxmlformats.org/markup-compatibility/2006" xmlns:o="urn:schemas-microsoft-com:office:office" xmlns:r="http://schemas.openxmlformats.org/officeDocument/2006/relationships" xmlns:m="http://schemas.openxmlformats.org/officeDocument/2006/math" xmlns:v="urn:schemas-microsoft-com:vml" xmlns:wp14="http://schemas.microsoft.com/office/word/2010/wordprocessingDrawing" xmlns:wp="http://schemas.openxmlformats.org/drawingml/2006/wordprocessingDrawing" xmlns:w10="urn:schemas-microsoft-com:office:word" xmlns:w="http://schemas.openxmlformats.org/wordprocessingml/2006/main" xmlns:w14="http://schemas.microsoft.com/office/word/2010/wordml" xmlns:w15="http://schemas.microsoft.com/office/word/2012/wordml" xmlns:wpg="http://schemas.microsoft.com/office/word/2010/wordprocessingGroup" xmlns:wpi="http://schemas.microsoft.com/office/word/2010/wordprocessingInk" xmlns:wne="http://schemas.microsoft.com/office/word/2006/wordml" xmlns:wps="http://schemas.microsoft.com/office/word/2010/wordprocessingShape" mc:Ignorable="w14 w15 wp14">
+<w:hdr xmlns:wpc="http://schemas.microsoft.com/office/word/2010/wordprocessingCanvas" xmlns:cx="http://schemas.microsoft.com/office/drawing/2014/chartex" xmlns:cx1="http://schemas.microsoft.com/office/drawing/2015/9/8/chartex" xmlns:cx2="http://schemas.microsoft.com/office/drawing/2015/10/21/chartex" xmlns:cx3="http://schemas.microsoft.com/office/drawing/2016/5/9/chartex" xmlns:cx4="http://schemas.microsoft.com/office/drawing/2016/5/10/chartex" xmlns:cx5="http://schemas.microsoft.com/office/drawing/2016/5/11/chartex" xmlns:cx6="http://schemas.microsoft.com/office/drawing/2016/5/12/chartex" xmlns:cx7="http://schemas.microsoft.com/office/drawing/2016/5/13/chartex" xmlns:cx8="http://schemas.microsoft.com/office/drawing/2016/5/14/chartex" xmlns:mc="http://schemas.openxmlformats.org/markup-compatibility/2006" xmlns:aink="http://schemas.microsoft.com/office/drawing/2016/ink" xmlns:am3d="http://schemas.microsoft.com/office/drawing/2017/model3d" xmlns:o="urn:schemas-microsoft-com:office:office" xmlns:oel="http://schemas.microsoft.com/office/2019/extlst" xmlns:r="http://schemas.openxmlformats.org/officeDocument/2006/relationships" xmlns:m="http://schemas.openxmlformats.org/officeDocument/2006/math" xmlns:v="urn:schemas-microsoft-com:vml" xmlns:wp14="http://schemas.microsoft.com/office/word/2010/wordprocessingDrawing" xmlns:wp="http://schemas.openxmlformats.org/drawingml/2006/wordprocessingDrawing" xmlns:w10="urn:schemas-microsoft-com:office:word" xmlns:w="http://schemas.openxmlformats.org/wordprocessingml/2006/main" xmlns:w14="http://schemas.microsoft.com/office/word/2010/wordml" xmlns:w15="http://schemas.microsoft.com/office/word/2012/wordml" xmlns:w16cex="http://schemas.microsoft.com/office/word/2018/wordml/cex" xmlns:w16cid="http://schemas.microsoft.com/office/word/2016/wordml/cid" xmlns:w16="http://schemas.microsoft.com/office/word/2018/wordml" xmlns:w16du="http://schemas.microsoft.com/office/word/2023/wordml/word16du" xmlns:w16sdtdh="http://schemas.microsoft.com/office/word/2020/wordml/sdtdatahash" xmlns:w16sdtfl="http://schemas.microsoft.com/office/word/2024/wordml/sdtformatlock" xmlns:w16se="http://schemas.microsoft.com/office/word/2015/wordml/symex" xmlns:wpg="http://schemas.microsoft.com/office/word/2010/wordprocessingGroup" xmlns:wpi="http://schemas.microsoft.com/office/word/2010/wordprocessingInk" xmlns:wne="http://schemas.microsoft.com/office/word/2006/wordml" xmlns:wps="http://schemas.microsoft.com/office/word/2010/wordprocessingShape" mc:Ignorable="w14 w15 w16se w16cid w16 w16cex w16sdtdh w16sdtfl w16du wp14">
   <w:p>
     <w:pPr>
       <w:pStyle w:val="Header"/>
@@ -1292,7 +1344,7 @@
       <w:rPr>
         <w:noProof/>
       </w:rPr>
-      <w:pict>
+      <w:pict w14:anchorId="7A6B5B86">
         <v:shapetype id="_x0000_t75" coordsize="21600,21600" o:spt="75" o:preferrelative="t" path="m@4@5l@4@11@9@11@9@5xe" filled="f" stroked="f">
           <v:stroke joinstyle="miter"/>
           <v:formulas>
@@ -1312,7 +1364,7 @@
           <v:path o:extrusionok="f" gradientshapeok="t" o:connecttype="rect"/>
           <o:lock v:ext="edit" aspectratio="t"/>
         </v:shapetype>
-        <v:shape id="WordPictureWatermark631978844" o:spid="_x0000_s2056" type="#_x0000_t75" style="position:absolute;margin-left:0;margin-top:0;width:467.95pt;height:311.4pt;z-index:-251657216;mso-position-horizontal:center;mso-position-horizontal-relative:margin;mso-position-vertical:center;mso-position-vertical-relative:margin" o:allowincell="f">
+        <v:shape id="WordPictureWatermark631978844" o:spid="_x0000_s1032" type="#_x0000_t75" style="position:absolute;margin-left:0;margin-top:0;width:467.95pt;height:311.4pt;z-index:-251657216;mso-position-horizontal:center;mso-position-horizontal-relative:margin;mso-position-vertical:center;mso-position-vertical-relative:margin" o:allowincell="f">
           <v:imagedata r:id="rId1" o:title="library" gain="19661f" blacklevel="22938f"/>
           <w10:wrap anchorx="margin" anchory="margin"/>
         </v:shape>
@@ -1323,7 +1375,7 @@
 </file>
 
 <file path=word/header2.xml><?xml version="1.0" encoding="utf-8"?>
-<w:hdr xmlns:wpc="http://schemas.microsoft.com/office/word/2010/wordprocessingCanvas" xmlns:mc="http://schemas.openxmlformats.org/markup-compatibility/2006" xmlns:o="urn:schemas-microsoft-com:office:office" xmlns:r="http://schemas.openxmlformats.org/officeDocument/2006/relationships" xmlns:m="http://schemas.openxmlformats.org/officeDocument/2006/math" xmlns:v="urn:schemas-microsoft-com:vml" xmlns:wp14="http://schemas.microsoft.com/office/word/2010/wordprocessingDrawing" xmlns:wp="http://schemas.openxmlformats.org/drawingml/2006/wordprocessingDrawing" xmlns:w10="urn:schemas-microsoft-com:office:word" xmlns:w="http://schemas.openxmlformats.org/wordprocessingml/2006/main" xmlns:w14="http://schemas.microsoft.com/office/word/2010/wordml" xmlns:w15="http://schemas.microsoft.com/office/word/2012/wordml" xmlns:wpg="http://schemas.microsoft.com/office/word/2010/wordprocessingGroup" xmlns:wpi="http://schemas.microsoft.com/office/word/2010/wordprocessingInk" xmlns:wne="http://schemas.microsoft.com/office/word/2006/wordml" xmlns:wps="http://schemas.microsoft.com/office/word/2010/wordprocessingShape" mc:Ignorable="w14 w15 wp14">
+<w:hdr xmlns:wpc="http://schemas.microsoft.com/office/word/2010/wordprocessingCanvas" xmlns:cx="http://schemas.microsoft.com/office/drawing/2014/chartex" xmlns:cx1="http://schemas.microsoft.com/office/drawing/2015/9/8/chartex" xmlns:cx2="http://schemas.microsoft.com/office/drawing/2015/10/21/chartex" xmlns:cx3="http://schemas.microsoft.com/office/drawing/2016/5/9/chartex" xmlns:cx4="http://schemas.microsoft.com/office/drawing/2016/5/10/chartex" xmlns:cx5="http://schemas.microsoft.com/office/drawing/2016/5/11/chartex" xmlns:cx6="http://schemas.microsoft.com/office/drawing/2016/5/12/chartex" xmlns:cx7="http://schemas.microsoft.com/office/drawing/2016/5/13/chartex" xmlns:cx8="http://schemas.microsoft.com/office/drawing/2016/5/14/chartex" xmlns:mc="http://schemas.openxmlformats.org/markup-compatibility/2006" xmlns:aink="http://schemas.microsoft.com/office/drawing/2016/ink" xmlns:am3d="http://schemas.microsoft.com/office/drawing/2017/model3d" xmlns:o="urn:schemas-microsoft-com:office:office" xmlns:oel="http://schemas.microsoft.com/office/2019/extlst" xmlns:r="http://schemas.openxmlformats.org/officeDocument/2006/relationships" xmlns:m="http://schemas.openxmlformats.org/officeDocument/2006/math" xmlns:v="urn:schemas-microsoft-com:vml" xmlns:wp14="http://schemas.microsoft.com/office/word/2010/wordprocessingDrawing" xmlns:wp="http://schemas.openxmlformats.org/drawingml/2006/wordprocessingDrawing" xmlns:w10="urn:schemas-microsoft-com:office:word" xmlns:w="http://schemas.openxmlformats.org/wordprocessingml/2006/main" xmlns:w14="http://schemas.microsoft.com/office/word/2010/wordml" xmlns:w15="http://schemas.microsoft.com/office/word/2012/wordml" xmlns:w16cex="http://schemas.microsoft.com/office/word/2018/wordml/cex" xmlns:w16cid="http://schemas.microsoft.com/office/word/2016/wordml/cid" xmlns:w16="http://schemas.microsoft.com/office/word/2018/wordml" xmlns:w16du="http://schemas.microsoft.com/office/word/2023/wordml/word16du" xmlns:w16sdtdh="http://schemas.microsoft.com/office/word/2020/wordml/sdtdatahash" xmlns:w16sdtfl="http://schemas.microsoft.com/office/word/2024/wordml/sdtformatlock" xmlns:w16se="http://schemas.microsoft.com/office/word/2015/wordml/symex" xmlns:wpg="http://schemas.microsoft.com/office/word/2010/wordprocessingGroup" xmlns:wpi="http://schemas.microsoft.com/office/word/2010/wordprocessingInk" xmlns:wne="http://schemas.microsoft.com/office/word/2006/wordml" xmlns:wps="http://schemas.microsoft.com/office/word/2010/wordprocessingShape" mc:Ignorable="w14 w15 w16se w16cid w16 w16cex w16sdtdh w16sdtfl w16du wp14">
   <w:p>
     <w:pPr>
       <w:pStyle w:val="Header"/>
@@ -1332,7 +1384,7 @@
       <w:rPr>
         <w:noProof/>
       </w:rPr>
-      <w:pict>
+      <w:pict w14:anchorId="03A31B32">
         <v:shapetype id="_x0000_t75" coordsize="21600,21600" o:spt="75" o:preferrelative="t" path="m@4@5l@4@11@9@11@9@5xe" filled="f" stroked="f">
           <v:stroke joinstyle="miter"/>
           <v:formulas>
@@ -1352,7 +1404,7 @@
           <v:path o:extrusionok="f" gradientshapeok="t" o:connecttype="rect"/>
           <o:lock v:ext="edit" aspectratio="t"/>
         </v:shapetype>
-        <v:shape id="WordPictureWatermark631978845" o:spid="_x0000_s2057" type="#_x0000_t75" style="position:absolute;margin-left:0;margin-top:0;width:467.95pt;height:311.4pt;z-index:-251656192;mso-position-horizontal:center;mso-position-horizontal-relative:margin;mso-position-vertical:center;mso-position-vertical-relative:margin" o:allowincell="f">
+        <v:shape id="WordPictureWatermark631978845" o:spid="_x0000_s1033" type="#_x0000_t75" style="position:absolute;margin-left:0;margin-top:0;width:467.95pt;height:311.4pt;z-index:-251656192;mso-position-horizontal:center;mso-position-horizontal-relative:margin;mso-position-vertical:center;mso-position-vertical-relative:margin" o:allowincell="f">
           <v:imagedata r:id="rId1" o:title="library" gain="19661f" blacklevel="22938f"/>
           <w10:wrap anchorx="margin" anchory="margin"/>
         </v:shape>
@@ -1363,7 +1415,7 @@
 </file>
 
 <file path=word/header3.xml><?xml version="1.0" encoding="utf-8"?>
-<w:hdr xmlns:wpc="http://schemas.microsoft.com/office/word/2010/wordprocessingCanvas" xmlns:mc="http://schemas.openxmlformats.org/markup-compatibility/2006" xmlns:o="urn:schemas-microsoft-com:office:office" xmlns:r="http://schemas.openxmlformats.org/officeDocument/2006/relationships" xmlns:m="http://schemas.openxmlformats.org/officeDocument/2006/math" xmlns:v="urn:schemas-microsoft-com:vml" xmlns:wp14="http://schemas.microsoft.com/office/word/2010/wordprocessingDrawing" xmlns:wp="http://schemas.openxmlformats.org/drawingml/2006/wordprocessingDrawing" xmlns:w10="urn:schemas-microsoft-com:office:word" xmlns:w="http://schemas.openxmlformats.org/wordprocessingml/2006/main" xmlns:w14="http://schemas.microsoft.com/office/word/2010/wordml" xmlns:w15="http://schemas.microsoft.com/office/word/2012/wordml" xmlns:wpg="http://schemas.microsoft.com/office/word/2010/wordprocessingGroup" xmlns:wpi="http://schemas.microsoft.com/office/word/2010/wordprocessingInk" xmlns:wne="http://schemas.microsoft.com/office/word/2006/wordml" xmlns:wps="http://schemas.microsoft.com/office/word/2010/wordprocessingShape" mc:Ignorable="w14 w15 wp14">
+<w:hdr xmlns:wpc="http://schemas.microsoft.com/office/word/2010/wordprocessingCanvas" xmlns:cx="http://schemas.microsoft.com/office/drawing/2014/chartex" xmlns:cx1="http://schemas.microsoft.com/office/drawing/2015/9/8/chartex" xmlns:cx2="http://schemas.microsoft.com/office/drawing/2015/10/21/chartex" xmlns:cx3="http://schemas.microsoft.com/office/drawing/2016/5/9/chartex" xmlns:cx4="http://schemas.microsoft.com/office/drawing/2016/5/10/chartex" xmlns:cx5="http://schemas.microsoft.com/office/drawing/2016/5/11/chartex" xmlns:cx6="http://schemas.microsoft.com/office/drawing/2016/5/12/chartex" xmlns:cx7="http://schemas.microsoft.com/office/drawing/2016/5/13/chartex" xmlns:cx8="http://schemas.microsoft.com/office/drawing/2016/5/14/chartex" xmlns:mc="http://schemas.openxmlformats.org/markup-compatibility/2006" xmlns:aink="http://schemas.microsoft.com/office/drawing/2016/ink" xmlns:am3d="http://schemas.microsoft.com/office/drawing/2017/model3d" xmlns:o="urn:schemas-microsoft-com:office:office" xmlns:oel="http://schemas.microsoft.com/office/2019/extlst" xmlns:r="http://schemas.openxmlformats.org/officeDocument/2006/relationships" xmlns:m="http://schemas.openxmlformats.org/officeDocument/2006/math" xmlns:v="urn:schemas-microsoft-com:vml" xmlns:wp14="http://schemas.microsoft.com/office/word/2010/wordprocessingDrawing" xmlns:wp="http://schemas.openxmlformats.org/drawingml/2006/wordprocessingDrawing" xmlns:w10="urn:schemas-microsoft-com:office:word" xmlns:w="http://schemas.openxmlformats.org/wordprocessingml/2006/main" xmlns:w14="http://schemas.microsoft.com/office/word/2010/wordml" xmlns:w15="http://schemas.microsoft.com/office/word/2012/wordml" xmlns:w16cex="http://schemas.microsoft.com/office/word/2018/wordml/cex" xmlns:w16cid="http://schemas.microsoft.com/office/word/2016/wordml/cid" xmlns:w16="http://schemas.microsoft.com/office/word/2018/wordml" xmlns:w16du="http://schemas.microsoft.com/office/word/2023/wordml/word16du" xmlns:w16sdtdh="http://schemas.microsoft.com/office/word/2020/wordml/sdtdatahash" xmlns:w16sdtfl="http://schemas.microsoft.com/office/word/2024/wordml/sdtformatlock" xmlns:w16se="http://schemas.microsoft.com/office/word/2015/wordml/symex" xmlns:wpg="http://schemas.microsoft.com/office/word/2010/wordprocessingGroup" xmlns:wpi="http://schemas.microsoft.com/office/word/2010/wordprocessingInk" xmlns:wne="http://schemas.microsoft.com/office/word/2006/wordml" xmlns:wps="http://schemas.microsoft.com/office/word/2010/wordprocessingShape" mc:Ignorable="w14 w15 w16se w16cid w16 w16cex w16sdtdh w16sdtfl w16du wp14">
   <w:p>
     <w:pPr>
       <w:pStyle w:val="Header"/>
@@ -1372,7 +1424,7 @@
       <w:rPr>
         <w:noProof/>
       </w:rPr>
-      <w:pict>
+      <w:pict w14:anchorId="2356F5DA">
         <v:shapetype id="_x0000_t75" coordsize="21600,21600" o:spt="75" o:preferrelative="t" path="m@4@5l@4@11@9@11@9@5xe" filled="f" stroked="f">
           <v:stroke joinstyle="miter"/>
           <v:formulas>
@@ -1392,7 +1444,7 @@
           <v:path o:extrusionok="f" gradientshapeok="t" o:connecttype="rect"/>
           <o:lock v:ext="edit" aspectratio="t"/>
         </v:shapetype>
-        <v:shape id="WordPictureWatermark631978843" o:spid="_x0000_s2055" type="#_x0000_t75" style="position:absolute;margin-left:0;margin-top:0;width:467.95pt;height:311.4pt;z-index:-251658240;mso-position-horizontal:center;mso-position-horizontal-relative:margin;mso-position-vertical:center;mso-position-vertical-relative:margin" o:allowincell="f">
+        <v:shape id="WordPictureWatermark631978843" o:spid="_x0000_s1031" type="#_x0000_t75" style="position:absolute;margin-left:0;margin-top:0;width:467.95pt;height:311.4pt;z-index:-251658240;mso-position-horizontal:center;mso-position-horizontal-relative:margin;mso-position-vertical:center;mso-position-vertical-relative:margin" o:allowincell="f">
           <v:imagedata r:id="rId1" o:title="library" gain="19661f" blacklevel="22938f"/>
           <w10:wrap anchorx="margin" anchory="margin"/>
         </v:shape>
@@ -1403,7 +1455,7 @@
 </file>
 
 <file path=word/numbering.xml><?xml version="1.0" encoding="utf-8"?>
-<w:numbering xmlns:wpc="http://schemas.microsoft.com/office/word/2010/wordprocessingCanvas" xmlns:mc="http://schemas.openxmlformats.org/markup-compatibility/2006" xmlns:o="urn:schemas-microsoft-com:office:office" xmlns:r="http://schemas.openxmlformats.org/officeDocument/2006/relationships" xmlns:m="http://schemas.openxmlformats.org/officeDocument/2006/math" xmlns:v="urn:schemas-microsoft-com:vml" xmlns:wp14="http://schemas.microsoft.com/office/word/2010/wordprocessingDrawing" xmlns:wp="http://schemas.openxmlformats.org/drawingml/2006/wordprocessingDrawing" xmlns:w10="urn:schemas-microsoft-com:office:word" xmlns:w="http://schemas.openxmlformats.org/wordprocessingml/2006/main" xmlns:w14="http://schemas.microsoft.com/office/word/2010/wordml" xmlns:w15="http://schemas.microsoft.com/office/word/2012/wordml" xmlns:wpg="http://schemas.microsoft.com/office/word/2010/wordprocessingGroup" xmlns:wpi="http://schemas.microsoft.com/office/word/2010/wordprocessingInk" xmlns:wne="http://schemas.microsoft.com/office/word/2006/wordml" xmlns:wps="http://schemas.microsoft.com/office/word/2010/wordprocessingShape" mc:Ignorable="w14 w15 wp14">
+<w:numbering xmlns:wpc="http://schemas.microsoft.com/office/word/2010/wordprocessingCanvas" xmlns:cx="http://schemas.microsoft.com/office/drawing/2014/chartex" xmlns:cx1="http://schemas.microsoft.com/office/drawing/2015/9/8/chartex" xmlns:cx2="http://schemas.microsoft.com/office/drawing/2015/10/21/chartex" xmlns:cx3="http://schemas.microsoft.com/office/drawing/2016/5/9/chartex" xmlns:cx4="http://schemas.microsoft.com/office/drawing/2016/5/10/chartex" xmlns:cx5="http://schemas.microsoft.com/office/drawing/2016/5/11/chartex" xmlns:cx6="http://schemas.microsoft.com/office/drawing/2016/5/12/chartex" xmlns:cx7="http://schemas.microsoft.com/office/drawing/2016/5/13/chartex" xmlns:cx8="http://schemas.microsoft.com/office/drawing/2016/5/14/chartex" xmlns:mc="http://schemas.openxmlformats.org/markup-compatibility/2006" xmlns:aink="http://schemas.microsoft.com/office/drawing/2016/ink" xmlns:am3d="http://schemas.microsoft.com/office/drawing/2017/model3d" xmlns:o="urn:schemas-microsoft-com:office:office" xmlns:oel="http://schemas.microsoft.com/office/2019/extlst" xmlns:r="http://schemas.openxmlformats.org/officeDocument/2006/relationships" xmlns:m="http://schemas.openxmlformats.org/officeDocument/2006/math" xmlns:v="urn:schemas-microsoft-com:vml" xmlns:wp14="http://schemas.microsoft.com/office/word/2010/wordprocessingDrawing" xmlns:wp="http://schemas.openxmlformats.org/drawingml/2006/wordprocessingDrawing" xmlns:w10="urn:schemas-microsoft-com:office:word" xmlns:w="http://schemas.openxmlformats.org/wordprocessingml/2006/main" xmlns:w14="http://schemas.microsoft.com/office/word/2010/wordml" xmlns:w15="http://schemas.microsoft.com/office/word/2012/wordml" xmlns:w16cex="http://schemas.microsoft.com/office/word/2018/wordml/cex" xmlns:w16cid="http://schemas.microsoft.com/office/word/2016/wordml/cid" xmlns:w16="http://schemas.microsoft.com/office/word/2018/wordml" xmlns:w16du="http://schemas.microsoft.com/office/word/2023/wordml/word16du" xmlns:w16sdtdh="http://schemas.microsoft.com/office/word/2020/wordml/sdtdatahash" xmlns:w16sdtfl="http://schemas.microsoft.com/office/word/2024/wordml/sdtformatlock" xmlns:w16se="http://schemas.microsoft.com/office/word/2015/wordml/symex" xmlns:wpg="http://schemas.microsoft.com/office/word/2010/wordprocessingGroup" xmlns:wpi="http://schemas.microsoft.com/office/word/2010/wordprocessingInk" xmlns:wne="http://schemas.microsoft.com/office/word/2006/wordml" xmlns:wps="http://schemas.microsoft.com/office/word/2010/wordprocessingShape" mc:Ignorable="w14 w15 w16se w16cid w16 w16cex w16sdtdh w16sdtfl w16du wp14">
   <w:numPicBullet w:numPicBulletId="0">
     <w:pict>
       <v:shapetype id="_x0000_t75" coordsize="21600,21600" o:spt="75" o:preferrelative="t" path="m@4@5l@4@11@9@11@9@5xe" filled="f" stroked="f">
@@ -1425,7 +1477,7 @@
         <v:path o:extrusionok="f" gradientshapeok="t" o:connecttype="rect"/>
         <o:lock v:ext="edit" aspectratio="t"/>
       </v:shapetype>
-      <v:shape id="_x0000_i1029" type="#_x0000_t75" style="width:11.4pt;height:11.4pt" o:bullet="t">
+      <v:shape id="_x0000_i1025" type="#_x0000_t75" style="width:11.5pt;height:11.5pt" o:bullet="t">
         <v:imagedata r:id="rId1" o:title="msoA04C"/>
       </v:shape>
     </w:pict>
@@ -2657,47 +2709,47 @@
       </w:pPr>
     </w:lvl>
   </w:abstractNum>
-  <w:num w:numId="1">
+  <w:num w:numId="1" w16cid:durableId="169177426">
     <w:abstractNumId w:val="1"/>
   </w:num>
-  <w:num w:numId="2">
+  <w:num w:numId="2" w16cid:durableId="2036953897">
     <w:abstractNumId w:val="7"/>
   </w:num>
-  <w:num w:numId="3">
+  <w:num w:numId="3" w16cid:durableId="588272500">
     <w:abstractNumId w:val="2"/>
   </w:num>
-  <w:num w:numId="4">
+  <w:num w:numId="4" w16cid:durableId="524827632">
     <w:abstractNumId w:val="10"/>
   </w:num>
-  <w:num w:numId="5">
+  <w:num w:numId="5" w16cid:durableId="1091005360">
     <w:abstractNumId w:val="9"/>
   </w:num>
-  <w:num w:numId="6">
+  <w:num w:numId="6" w16cid:durableId="70586799">
     <w:abstractNumId w:val="5"/>
   </w:num>
-  <w:num w:numId="7">
+  <w:num w:numId="7" w16cid:durableId="499539615">
     <w:abstractNumId w:val="6"/>
   </w:num>
-  <w:num w:numId="8">
+  <w:num w:numId="8" w16cid:durableId="1879320742">
     <w:abstractNumId w:val="0"/>
   </w:num>
-  <w:num w:numId="9">
+  <w:num w:numId="9" w16cid:durableId="1768575171">
     <w:abstractNumId w:val="11"/>
   </w:num>
-  <w:num w:numId="10">
+  <w:num w:numId="10" w16cid:durableId="1075977251">
     <w:abstractNumId w:val="8"/>
   </w:num>
-  <w:num w:numId="11">
+  <w:num w:numId="11" w16cid:durableId="1024407701">
     <w:abstractNumId w:val="3"/>
   </w:num>
-  <w:num w:numId="12">
+  <w:num w:numId="12" w16cid:durableId="1935169956">
     <w:abstractNumId w:val="4"/>
   </w:num>
 </w:numbering>
 </file>
 
 <file path=word/styles.xml><?xml version="1.0" encoding="utf-8"?>
-<w:styles xmlns:mc="http://schemas.openxmlformats.org/markup-compatibility/2006" xmlns:r="http://schemas.openxmlformats.org/officeDocument/2006/relationships" xmlns:w="http://schemas.openxmlformats.org/wordprocessingml/2006/main" xmlns:w14="http://schemas.microsoft.com/office/word/2010/wordml" xmlns:w15="http://schemas.microsoft.com/office/word/2012/wordml" mc:Ignorable="w14 w15">
+<w:styles xmlns:mc="http://schemas.openxmlformats.org/markup-compatibility/2006" xmlns:r="http://schemas.openxmlformats.org/officeDocument/2006/relationships" xmlns:w="http://schemas.openxmlformats.org/wordprocessingml/2006/main" xmlns:w14="http://schemas.microsoft.com/office/word/2010/wordml" xmlns:w15="http://schemas.microsoft.com/office/word/2012/wordml" xmlns:w16cex="http://schemas.microsoft.com/office/word/2018/wordml/cex" xmlns:w16cid="http://schemas.microsoft.com/office/word/2016/wordml/cid" xmlns:w16="http://schemas.microsoft.com/office/word/2018/wordml" xmlns:w16du="http://schemas.microsoft.com/office/word/2023/wordml/word16du" xmlns:w16sdtdh="http://schemas.microsoft.com/office/word/2020/wordml/sdtdatahash" xmlns:w16sdtfl="http://schemas.microsoft.com/office/word/2024/wordml/sdtformatlock" xmlns:w16se="http://schemas.microsoft.com/office/word/2015/wordml/symex" mc:Ignorable="w14 w15 w16se w16cid w16 w16cex w16sdtdh w16sdtfl w16du">
   <w:docDefaults>
     <w:rPrDefault>
       <w:rPr>
@@ -2713,7 +2765,7 @@
       </w:pPr>
     </w:pPrDefault>
   </w:docDefaults>
-  <w:latentStyles w:defLockedState="0" w:defUIPriority="99" w:defSemiHidden="0" w:defUnhideWhenUsed="0" w:defQFormat="0" w:count="371">
+  <w:latentStyles w:defLockedState="0" w:defUIPriority="99" w:defSemiHidden="0" w:defUnhideWhenUsed="0" w:defQFormat="0" w:count="376">
     <w:lsdException w:name="Normal" w:uiPriority="0" w:qFormat="1"/>
     <w:lsdException w:name="heading 1" w:uiPriority="9" w:qFormat="1"/>
     <w:lsdException w:name="heading 2" w:semiHidden="1" w:uiPriority="9" w:unhideWhenUsed="1" w:qFormat="1"/>
@@ -3085,6 +3137,11 @@
     <w:lsdException w:name="List Table 5 Dark Accent 6" w:uiPriority="50"/>
     <w:lsdException w:name="List Table 6 Colorful Accent 6" w:uiPriority="51"/>
     <w:lsdException w:name="List Table 7 Colorful Accent 6" w:uiPriority="52"/>
+    <w:lsdException w:name="Mention" w:semiHidden="1" w:unhideWhenUsed="1"/>
+    <w:lsdException w:name="Smart Hyperlink" w:semiHidden="1" w:unhideWhenUsed="1"/>
+    <w:lsdException w:name="Hashtag" w:semiHidden="1" w:unhideWhenUsed="1"/>
+    <w:lsdException w:name="Unresolved Mention" w:semiHidden="1" w:unhideWhenUsed="1"/>
+    <w:lsdException w:name="Smart Link" w:semiHidden="1" w:unhideWhenUsed="1"/>
   </w:latentStyles>
   <w:style w:type="paragraph" w:default="1" w:styleId="Normal">
     <w:name w:val="Normal"/>

</xml_diff>